<commit_message>
Describe D15 and the current suite count in the spec's version 2
Section 19.8 now names the two reworded instructions, INSTR-NEURO-EEG and
INSTR-ORTHO-INJECTION. It gives the live Safety results before and after
the change, notes the move to version 2 in the catalog and the registry,
and says that version 1 is denied. The section 8 note names their
registry version. Section 15.1 now reads 1543 passed, 1 skipped.

Co-Authored-By: Claude Opus 5.5 <noreply@anthropic.com>
</commit_message>
<xml_diff>
--- a/Hospital_Agent_Clean_v2.docx
+++ b/Hospital_Agent_Clean_v2.docx
@@ -28733,7 +28733,43 @@
           <w:szCs w:val="22"/>
           <w:rtl/>
         </w:rPr>
-        <w:t xml:space="preserve">). מקור ההוראות נלקח מהפנייה; פנייה בלי מקור נדחית עם </w:t>
+        <w:t xml:space="preserve">), בגרסה שבקטלוג: גרסה 1, וגרסה 2 ל־</w:t>
+      </w:r>
+      <w:r>
+        <w:rPr>
+          <w:rFonts w:ascii="David" w:eastAsia="David" w:hAnsi="David" w:cs="David"/>
+          <w:sz w:val="22"/>
+          <w:szCs w:val="22"/>
+          <w:rtl w:val="0"/>
+        </w:rPr>
+        <w:t xml:space="preserve">INSTR-NEURO-EEG</w:t>
+      </w:r>
+      <w:r>
+        <w:rPr>
+          <w:rFonts w:ascii="David" w:eastAsia="David" w:hAnsi="David" w:cs="David"/>
+          <w:sz w:val="22"/>
+          <w:szCs w:val="22"/>
+          <w:rtl/>
+        </w:rPr>
+        <w:t xml:space="preserve"> ול־</w:t>
+      </w:r>
+      <w:r>
+        <w:rPr>
+          <w:rFonts w:ascii="David" w:eastAsia="David" w:hAnsi="David" w:cs="David"/>
+          <w:sz w:val="22"/>
+          <w:szCs w:val="22"/>
+          <w:rtl w:val="0"/>
+        </w:rPr>
+        <w:t xml:space="preserve">INSTR-ORTHO-INJECTION</w:t>
+      </w:r>
+      <w:r>
+        <w:rPr>
+          <w:rFonts w:ascii="David" w:eastAsia="David" w:hAnsi="David" w:cs="David"/>
+          <w:sz w:val="22"/>
+          <w:szCs w:val="22"/>
+          <w:rtl/>
+        </w:rPr>
+        <w:t xml:space="preserve"> (סעיף 19.8). מקור ההוראות נלקח מהפנייה; פנייה בלי מקור נדחית עם </w:t>
       </w:r>
       <w:r>
         <w:rPr>
@@ -46955,7 +46991,7 @@
                 <w:szCs w:val="18"/>
                 <w:rtl/>
               </w:rPr>
-              <w:t xml:space="preserve">1540 </w:t>
+              <w:t xml:space="preserve">1543 </w:t>
             </w:r>
             <w:r>
               <w:rPr>
@@ -46964,7 +47000,7 @@
                 <w:szCs w:val="18"/>
                 <w:rtl w:val="0"/>
               </w:rPr>
-              <w:t xml:space="preserve">passed</w:t>
+              <w:t xml:space="preserve">passed, 1 skipped</w:t>
             </w:r>
           </w:p>
         </w:tc>
@@ -57053,8 +57089,14 @@
           <w:szCs w:val="22"/>
           <w:rtl/>
         </w:rPr>
-        <w:t xml:space="preserve"> נשארים 35/4/54 (תיקון 90). </w:t>
-      </w:r>
+        <w:t xml:space="preserve"> נשארים 35/4/54. (תיקון 90)</w:t>
+      </w:r>
+    </w:p>
+    <w:p>
+      <w:pPr>
+        <w:bidi/>
+        <w:spacing w:after="100"/>
+      </w:pPr>
       <w:r>
         <w:rPr>
           <w:rFonts w:ascii="David" w:eastAsia="David" w:hAnsi="David" w:cs="David"/>
@@ -57071,7 +57113,7 @@
           <w:szCs w:val="22"/>
           <w:rtl/>
         </w:rPr>
-        <w:t xml:space="preserve">: אחרי בדיקת ה־</w:t>
+        <w:t xml:space="preserve">: בבדיקת ה־</w:t>
       </w:r>
       <w:r>
         <w:rPr>
@@ -57089,43 +57131,142 @@
           <w:szCs w:val="22"/>
           <w:rtl/>
         </w:rPr>
-        <w:t xml:space="preserve"> החיה, שני טקסטים של הוראות הכנה נוסחו מחדש ועברו לגרסה 2. כמו כל מקור, גרסה נמסרת רק אם ה־</w:t>
-      </w:r>
-      <w:r>
-        <w:rPr>
-          <w:rFonts w:ascii="David" w:eastAsia="David" w:hAnsi="David" w:cs="David"/>
-          <w:sz w:val="22"/>
-          <w:szCs w:val="22"/>
-          <w:rtl w:val="0"/>
-        </w:rPr>
-        <w:t xml:space="preserve">source_id</w:t>
-      </w:r>
-      <w:r>
-        <w:rPr>
-          <w:rFonts w:ascii="David" w:eastAsia="David" w:hAnsi="David" w:cs="David"/>
-          <w:sz w:val="22"/>
-          <w:szCs w:val="22"/>
-          <w:rtl/>
-        </w:rPr>
-        <w:t xml:space="preserve"> והגרסה רשומים ב־</w:t>
-      </w:r>
-      <w:r>
-        <w:rPr>
-          <w:rFonts w:ascii="David" w:eastAsia="David" w:hAnsi="David" w:cs="David"/>
-          <w:sz w:val="22"/>
-          <w:szCs w:val="22"/>
-          <w:rtl w:val="0"/>
-        </w:rPr>
-        <w:t xml:space="preserve">Approved Source Registry</w:t>
-      </w:r>
-      <w:r>
-        <w:rPr>
-          <w:rFonts w:ascii="David" w:eastAsia="David" w:hAnsi="David" w:cs="David"/>
-          <w:sz w:val="22"/>
-          <w:szCs w:val="22"/>
-          <w:rtl/>
-        </w:rPr>
-        <w:t xml:space="preserve"> ובתוקף (§3.1).</w:t>
+        <w:t xml:space="preserve"> החיה סווג </w:t>
+      </w:r>
+      <w:r>
+        <w:rPr>
+          <w:rFonts w:ascii="David" w:eastAsia="David" w:hAnsi="David" w:cs="David"/>
+          <w:sz w:val="22"/>
+          <w:szCs w:val="22"/>
+          <w:rtl w:val="0"/>
+        </w:rPr>
+        <w:t xml:space="preserve">INSTR-ORTHO-INJECTION</w:t>
+      </w:r>
+      <w:r>
+        <w:rPr>
+          <w:rFonts w:ascii="David" w:eastAsia="David" w:hAnsi="David" w:cs="David"/>
+          <w:sz w:val="22"/>
+          <w:szCs w:val="22"/>
+          <w:rtl/>
+        </w:rPr>
+        <w:t xml:space="preserve"> כ־</w:t>
+      </w:r>
+      <w:r>
+        <w:rPr>
+          <w:rFonts w:ascii="David" w:eastAsia="David" w:hAnsi="David" w:cs="David"/>
+          <w:sz w:val="22"/>
+          <w:szCs w:val="22"/>
+          <w:rtl w:val="0"/>
+        </w:rPr>
+        <w:t xml:space="preserve">HighRisk</w:t>
+      </w:r>
+      <w:r>
+        <w:rPr>
+          <w:rFonts w:ascii="David" w:eastAsia="David" w:hAnsi="David" w:cs="David"/>
+          <w:sz w:val="22"/>
+          <w:szCs w:val="22"/>
+          <w:rtl/>
+        </w:rPr>
+        <w:t xml:space="preserve"> ב־3 מתוך 3 ריצות, ו־</w:t>
+      </w:r>
+      <w:r>
+        <w:rPr>
+          <w:rFonts w:ascii="David" w:eastAsia="David" w:hAnsi="David" w:cs="David"/>
+          <w:sz w:val="22"/>
+          <w:szCs w:val="22"/>
+          <w:rtl w:val="0"/>
+        </w:rPr>
+        <w:t xml:space="preserve">INSTR-NEURO-EEG</w:t>
+      </w:r>
+      <w:r>
+        <w:rPr>
+          <w:rFonts w:ascii="David" w:eastAsia="David" w:hAnsi="David" w:cs="David"/>
+          <w:sz w:val="22"/>
+          <w:szCs w:val="22"/>
+          <w:rtl/>
+        </w:rPr>
+        <w:t xml:space="preserve"> ב־1 מתוך 3; 11 הטקסטים האחרים היו </w:t>
+      </w:r>
+      <w:r>
+        <w:rPr>
+          <w:rFonts w:ascii="David" w:eastAsia="David" w:hAnsi="David" w:cs="David"/>
+          <w:sz w:val="22"/>
+          <w:szCs w:val="22"/>
+          <w:rtl w:val="0"/>
+        </w:rPr>
+        <w:t xml:space="preserve">MediumRisk</w:t>
+      </w:r>
+      <w:r>
+        <w:rPr>
+          <w:rFonts w:ascii="David" w:eastAsia="David" w:hAnsi="David" w:cs="David"/>
+          <w:sz w:val="22"/>
+          <w:szCs w:val="22"/>
+          <w:rtl/>
+        </w:rPr>
+        <w:t xml:space="preserve"> ב־3 מתוך 3. שני הטקסטים נוסחו מחדש כטקסט לוגיסטי בלבד: שאלות על תרופות מופנות לרופא המפנה, ורשימת התרופות נמסרת בקבלה. שניהם עברו לגרסה 2 בקטלוג וב־</w:t>
+      </w:r>
+      <w:r>
+        <w:rPr>
+          <w:rFonts w:ascii="David" w:eastAsia="David" w:hAnsi="David" w:cs="David"/>
+          <w:sz w:val="22"/>
+          <w:szCs w:val="22"/>
+          <w:rtl w:val="0"/>
+        </w:rPr>
+        <w:t xml:space="preserve">Approved Source Registry.</w:t>
+      </w:r>
+      <w:r>
+        <w:rPr>
+          <w:rFonts w:ascii="David" w:eastAsia="David" w:hAnsi="David" w:cs="David"/>
+          <w:sz w:val="22"/>
+          <w:szCs w:val="22"/>
+          <w:rtl/>
+        </w:rPr>
+        <w:t xml:space="preserve"> גרסה 1 של שניהם כבר אינה ברישום, ולכן היא נדחית (</w:t>
+      </w:r>
+      <w:r>
+        <w:rPr>
+          <w:rFonts w:ascii="David" w:eastAsia="David" w:hAnsi="David" w:cs="David"/>
+          <w:sz w:val="22"/>
+          <w:szCs w:val="22"/>
+          <w:rtl w:val="0"/>
+        </w:rPr>
+        <w:t xml:space="preserve">fail-closed</w:t>
+      </w:r>
+      <w:r>
+        <w:rPr>
+          <w:rFonts w:ascii="David" w:eastAsia="David" w:hAnsi="David" w:cs="David"/>
+          <w:sz w:val="22"/>
+          <w:szCs w:val="22"/>
+          <w:rtl/>
+        </w:rPr>
+        <w:t xml:space="preserve">). אחרי השינוי שניהם </w:t>
+      </w:r>
+      <w:r>
+        <w:rPr>
+          <w:rFonts w:ascii="David" w:eastAsia="David" w:hAnsi="David" w:cs="David"/>
+          <w:sz w:val="22"/>
+          <w:szCs w:val="22"/>
+          <w:rtl w:val="0"/>
+        </w:rPr>
+        <w:t xml:space="preserve">MediumRisk</w:t>
+      </w:r>
+      <w:r>
+        <w:rPr>
+          <w:rFonts w:ascii="David" w:eastAsia="David" w:hAnsi="David" w:cs="David"/>
+          <w:sz w:val="22"/>
+          <w:szCs w:val="22"/>
+          <w:rtl/>
+        </w:rPr>
+        <w:t xml:space="preserve"> ב־3 מתוך 3 (8 מתוך 8 כולל ריצות המועמדים), בלי שום שינוי במסווג או ב־</w:t>
+      </w:r>
+      <w:r>
+        <w:rPr>
+          <w:rFonts w:ascii="David" w:eastAsia="David" w:hAnsi="David" w:cs="David"/>
+          <w:sz w:val="22"/>
+          <w:szCs w:val="22"/>
+          <w:rtl w:val="0"/>
+        </w:rPr>
+        <w:t xml:space="preserve">prompts.</w:t>
       </w:r>
     </w:p>
     <w:p>

</xml_diff>

<commit_message>
Show the classification and LLM calls in the journal, escalate Unsupported at once, keep an early escalation's classification
- /context returns the case's latest intent and safety level and its LLM attempts
  (llm_usage: call, source, outcome, time - no text, tokens or cost); the journal
  shows the classification on the row that made it - an earlier one of a
  re-classified case says it was replaced - and each LLM call on the row after it.
- An Unsupported intent escalates from Classified as PlanningFailed with reason
  intent_unsupported, without a Planner call whose answer was known (row 31).
- Open finding 02: an escalation straight from Classifying (MedicalQuestion,
  SafetyEscalation) keeps the intent and safety level the Classifier answered
  (RECORD_EARLY_CLASSIFICATION, row 96). The section 3 table is unchanged.
- spec_corrections rows 95-96; Hospital_Agent_Clean_v2 chapters 19.9-19.10.

Co-Authored-By: Claude Opus 5.5 <noreply@anthropic.com>
</commit_message>
<xml_diff>
--- a/Hospital_Agent_Clean_v2.docx
+++ b/Hospital_Agent_Clean_v2.docx
@@ -46991,7 +46991,7 @@
                 <w:szCs w:val="18"/>
                 <w:rtl/>
               </w:rPr>
-              <w:t xml:space="preserve">1543 </w:t>
+              <w:t xml:space="preserve">1725 </w:t>
             </w:r>
             <w:r>
               <w:rPr>
@@ -47000,7 +47000,52 @@
                 <w:szCs w:val="18"/>
                 <w:rtl w:val="0"/>
               </w:rPr>
-              <w:t xml:space="preserve">passed, 1 skipped</w:t>
+              <w:t xml:space="preserve">passed, 2 skipped, 3 xfailed</w:t>
+            </w:r>
+            <w:r>
+              <w:rPr>
+                <w:rFonts w:ascii="David" w:eastAsia="David" w:hAnsi="David" w:cs="David"/>
+                <w:sz w:val="18"/>
+                <w:szCs w:val="18"/>
+                <w:rtl/>
+              </w:rPr>
+              <w:t xml:space="preserve"> (</w:t>
+            </w:r>
+            <w:r>
+              <w:rPr>
+                <w:rFonts w:ascii="David" w:eastAsia="David" w:hAnsi="David" w:cs="David"/>
+                <w:sz w:val="18"/>
+                <w:szCs w:val="18"/>
+                <w:rtl w:val="0"/>
+              </w:rPr>
+              <w:t xml:space="preserve">Postgres</w:t>
+            </w:r>
+            <w:r>
+              <w:rPr>
+                <w:rFonts w:ascii="David" w:eastAsia="David" w:hAnsi="David" w:cs="David"/>
+                <w:sz w:val="18"/>
+                <w:szCs w:val="18"/>
+                <w:rtl/>
+              </w:rPr>
+              <w:t xml:space="preserve"> מנוהל ב־</w:t>
+            </w:r>
+            <w:r>
+              <w:rPr>
+                <w:rFonts w:ascii="David" w:eastAsia="David" w:hAnsi="David" w:cs="David"/>
+                <w:sz w:val="18"/>
+                <w:szCs w:val="18"/>
+                <w:rtl w:val="0"/>
+              </w:rPr>
+              <w:t xml:space="preserve">RDS</w:t>
+            </w:r>
+            <w:r>
+              <w:rPr>
+                <w:rFonts w:ascii="David" w:eastAsia="David" w:hAnsi="David" w:cs="David"/>
+                <w:sz w:val="18"/>
+                <w:szCs w:val="18"/>
+                <w:rtl/>
+              </w:rPr>
+              <w:t xml:space="preserve">)</w:t>
             </w:r>
           </w:p>
         </w:tc>
@@ -54278,7 +54323,97 @@
           <w:szCs w:val="22"/>
           <w:rtl/>
         </w:rPr>
-        <w:t xml:space="preserve"> רץ בתהליך נפרד, ותהליך שנפל מוחלף.</w:t>
+        <w:t xml:space="preserve"> רץ בתהליך נפרד, ותהליך שנפל מוחלף. פנייה שסווגה </w:t>
+      </w:r>
+      <w:r>
+        <w:rPr>
+          <w:rFonts w:ascii="David" w:eastAsia="David" w:hAnsi="David" w:cs="David"/>
+          <w:sz w:val="22"/>
+          <w:szCs w:val="22"/>
+          <w:rtl w:val="0"/>
+        </w:rPr>
+        <w:t xml:space="preserve">Unsupported</w:t>
+      </w:r>
+      <w:r>
+        <w:rPr>
+          <w:rFonts w:ascii="David" w:eastAsia="David" w:hAnsi="David" w:cs="David"/>
+          <w:sz w:val="22"/>
+          <w:szCs w:val="22"/>
+          <w:rtl/>
+        </w:rPr>
+        <w:t xml:space="preserve"> מוסלמת מ־</w:t>
+      </w:r>
+      <w:r>
+        <w:rPr>
+          <w:rFonts w:ascii="David" w:eastAsia="David" w:hAnsi="David" w:cs="David"/>
+          <w:sz w:val="22"/>
+          <w:szCs w:val="22"/>
+          <w:rtl w:val="0"/>
+        </w:rPr>
+        <w:t xml:space="preserve">Classified</w:t>
+      </w:r>
+      <w:r>
+        <w:rPr>
+          <w:rFonts w:ascii="David" w:eastAsia="David" w:hAnsi="David" w:cs="David"/>
+          <w:sz w:val="22"/>
+          <w:szCs w:val="22"/>
+          <w:rtl/>
+        </w:rPr>
+        <w:t xml:space="preserve"> כ־</w:t>
+      </w:r>
+      <w:r>
+        <w:rPr>
+          <w:rFonts w:ascii="David" w:eastAsia="David" w:hAnsi="David" w:cs="David"/>
+          <w:sz w:val="22"/>
+          <w:szCs w:val="22"/>
+          <w:rtl w:val="0"/>
+        </w:rPr>
+        <w:t xml:space="preserve">PlanningFailed</w:t>
+      </w:r>
+      <w:r>
+        <w:rPr>
+          <w:rFonts w:ascii="David" w:eastAsia="David" w:hAnsi="David" w:cs="David"/>
+          <w:sz w:val="22"/>
+          <w:szCs w:val="22"/>
+          <w:rtl/>
+        </w:rPr>
+        <w:t xml:space="preserve"> עם </w:t>
+      </w:r>
+      <w:r>
+        <w:rPr>
+          <w:rFonts w:ascii="David" w:eastAsia="David" w:hAnsi="David" w:cs="David"/>
+          <w:sz w:val="22"/>
+          <w:szCs w:val="22"/>
+          <w:rtl w:val="0"/>
+        </w:rPr>
+        <w:t xml:space="preserve">intent_unsupported</w:t>
+      </w:r>
+      <w:r>
+        <w:rPr>
+          <w:rFonts w:ascii="David" w:eastAsia="David" w:hAnsi="David" w:cs="David"/>
+          <w:sz w:val="22"/>
+          <w:szCs w:val="22"/>
+          <w:rtl/>
+        </w:rPr>
+        <w:t xml:space="preserve">, בלי קריאה ל־</w:t>
+      </w:r>
+      <w:r>
+        <w:rPr>
+          <w:rFonts w:ascii="David" w:eastAsia="David" w:hAnsi="David" w:cs="David"/>
+          <w:sz w:val="22"/>
+          <w:szCs w:val="22"/>
+          <w:rtl w:val="0"/>
+        </w:rPr>
+        <w:t xml:space="preserve">Planner</w:t>
+      </w:r>
+      <w:r>
+        <w:rPr>
+          <w:rFonts w:ascii="David" w:eastAsia="David" w:hAnsi="David" w:cs="David"/>
+          <w:sz w:val="22"/>
+          <w:szCs w:val="22"/>
+          <w:rtl/>
+        </w:rPr>
+        <w:t xml:space="preserve"> (סעיף 19.10).</w:t>
       </w:r>
     </w:p>
     <w:p>
@@ -54299,7 +54434,7 @@
           <w:szCs w:val="26"/>
           <w:rtl/>
         </w:rPr>
-        <w:t xml:space="preserve">19. תוספות מעבר לאפיון הדמו (תתי-פרויקטים 9–18)</w:t>
+        <w:t xml:space="preserve">19. תוספות מעבר לאפיון הדמו (תתי-פרויקטים 9–19 ויומן המעקב)</w:t>
       </w:r>
     </w:p>
     <w:p>
@@ -54314,7 +54449,7 @@
           <w:szCs w:val="22"/>
           <w:rtl/>
         </w:rPr>
-        <w:t xml:space="preserve">תתי־פרויקטים 1–8 מממשים את הדמו של סעיפים 0–18. תתי־פרויקטים 9–18 נוספו בבקשה מפורשת של הבעלים, מעבר להיקף הדמו, ונרשמו ב־</w:t>
+        <w:t xml:space="preserve">תתי־פרויקטים 1–8 מממשים את הדמו של סעיפים 0–18. תתי־פרויקטים 9–19 נוספו בבקשה מפורשת של הבעלים, מעבר להיקף הדמו, ונרשמו ב־</w:t>
       </w:r>
       <w:r>
         <w:rPr>
@@ -54332,7 +54467,7 @@
           <w:szCs w:val="22"/>
           <w:rtl/>
         </w:rPr>
-        <w:t xml:space="preserve"> (שורות 65–93). אף אחד מהם אינו משנה את הרשימות של סעיף 2, את 41 השורות של סעיף 3, את קוד ה־</w:t>
+        <w:t xml:space="preserve"> (שורות 65–96). אף אחד מהם אינו משנה את הרשימות של סעיף 2, את 41 השורות של סעיף 3, את קוד ה־</w:t>
       </w:r>
       <w:r>
         <w:rPr>
@@ -57585,6 +57720,831 @@
           <w:rtl/>
         </w:rPr>
         <w:t xml:space="preserve"> (תיקון 89)</w:t>
+      </w:r>
+    </w:p>
+    <w:p>
+      <w:pPr>
+        <w:pStyle w:val="Heading2"/>
+        <w:keepNext/>
+        <w:keepLines/>
+        <w:bidi/>
+        <w:spacing w:before="220" w:after="100"/>
+      </w:pPr>
+      <w:r>
+        <w:rPr>
+          <w:rFonts w:ascii="David" w:eastAsia="David" w:hAnsi="David" w:cs="David"/>
+          <w:b/>
+          <w:bCs/>
+          <w:color w:val="000000"/>
+          <w:sz w:val="22"/>
+          <w:szCs w:val="22"/>
+          <w:rtl/>
+        </w:rPr>
+        <w:t xml:space="preserve">19.9 תת־פרויקט 19 – שימוש ועלות </w:t>
+      </w:r>
+      <w:r>
+        <w:rPr>
+          <w:rFonts w:ascii="David" w:eastAsia="David" w:hAnsi="David" w:cs="David"/>
+          <w:b/>
+          <w:bCs/>
+          <w:color w:val="000000"/>
+          <w:sz w:val="22"/>
+          <w:szCs w:val="22"/>
+          <w:rtl w:val="0"/>
+        </w:rPr>
+        <w:t xml:space="preserve">LLM</w:t>
+      </w:r>
+      <w:r>
+        <w:rPr>
+          <w:rFonts w:ascii="David" w:eastAsia="David" w:hAnsi="David" w:cs="David"/>
+          <w:b/>
+          <w:bCs/>
+          <w:color w:val="000000"/>
+          <w:sz w:val="22"/>
+          <w:szCs w:val="22"/>
+          <w:rtl/>
+        </w:rPr>
+        <w:t xml:space="preserve"> לכל פנייה</w:t>
+      </w:r>
+    </w:p>
+    <w:p>
+      <w:pPr>
+        <w:bidi/>
+        <w:spacing w:after="100"/>
+      </w:pPr>
+      <w:r>
+        <w:rPr>
+          <w:rFonts w:ascii="David" w:eastAsia="David" w:hAnsi="David" w:cs="David"/>
+          <w:sz w:val="22"/>
+          <w:szCs w:val="22"/>
+          <w:rtl/>
+        </w:rPr>
+        <w:t xml:space="preserve">כל ניסיון </w:t>
+      </w:r>
+      <w:r>
+        <w:rPr>
+          <w:rFonts w:ascii="David" w:eastAsia="David" w:hAnsi="David" w:cs="David"/>
+          <w:sz w:val="22"/>
+          <w:szCs w:val="22"/>
+          <w:rtl w:val="0"/>
+        </w:rPr>
+        <w:t xml:space="preserve">LLM</w:t>
+      </w:r>
+      <w:r>
+        <w:rPr>
+          <w:rFonts w:ascii="David" w:eastAsia="David" w:hAnsi="David" w:cs="David"/>
+          <w:sz w:val="22"/>
+          <w:szCs w:val="22"/>
+          <w:rtl/>
+        </w:rPr>
+        <w:t xml:space="preserve"> נרשם בטבלה </w:t>
+      </w:r>
+      <w:r>
+        <w:rPr>
+          <w:rFonts w:ascii="David" w:eastAsia="David" w:hAnsi="David" w:cs="David"/>
+          <w:sz w:val="22"/>
+          <w:szCs w:val="22"/>
+          <w:rtl w:val="0"/>
+        </w:rPr>
+        <w:t xml:space="preserve">llm_usage</w:t>
+      </w:r>
+      <w:r>
+        <w:rPr>
+          <w:rFonts w:ascii="David" w:eastAsia="David" w:hAnsi="David" w:cs="David"/>
+          <w:sz w:val="22"/>
+          <w:szCs w:val="22"/>
+          <w:rtl/>
+        </w:rPr>
+        <w:t xml:space="preserve"> (מיגרציה 0008): קריאות הסוכן (</w:t>
+      </w:r>
+      <w:r>
+        <w:rPr>
+          <w:rFonts w:ascii="David" w:eastAsia="David" w:hAnsi="David" w:cs="David"/>
+          <w:sz w:val="22"/>
+          <w:szCs w:val="22"/>
+          <w:rtl w:val="0"/>
+        </w:rPr>
+        <w:t xml:space="preserve">Intent, Safety, Planner, Response Evaluator</w:t>
+      </w:r>
+      <w:r>
+        <w:rPr>
+          <w:rFonts w:ascii="David" w:eastAsia="David" w:hAnsi="David" w:cs="David"/>
+          <w:sz w:val="22"/>
+          <w:szCs w:val="22"/>
+          <w:rtl/>
+        </w:rPr>
+        <w:t xml:space="preserve">) וקריאת שירות המסמכים לכל העלאה, עם קודים, מספרי טוקנים ועלות בלבד, בלי טקסט ובלי שדה מטופל (§12.3). הרישום הוא הנהלת חשבונות מחוץ ל־</w:t>
+      </w:r>
+      <w:r>
+        <w:rPr>
+          <w:rFonts w:ascii="David" w:eastAsia="David" w:hAnsi="David" w:cs="David"/>
+          <w:sz w:val="22"/>
+          <w:szCs w:val="22"/>
+          <w:rtl w:val="0"/>
+        </w:rPr>
+        <w:t xml:space="preserve">Audit</w:t>
+      </w:r>
+      <w:r>
+        <w:rPr>
+          <w:rFonts w:ascii="David" w:eastAsia="David" w:hAnsi="David" w:cs="David"/>
+          <w:sz w:val="22"/>
+          <w:szCs w:val="22"/>
+          <w:rtl/>
+        </w:rPr>
+        <w:t xml:space="preserve">: טרנזקציה קצרה משלו, בלי שורת </w:t>
+      </w:r>
+      <w:r>
+        <w:rPr>
+          <w:rFonts w:ascii="David" w:eastAsia="David" w:hAnsi="David" w:cs="David"/>
+          <w:sz w:val="22"/>
+          <w:szCs w:val="22"/>
+          <w:rtl w:val="0"/>
+        </w:rPr>
+        <w:t xml:space="preserve">Audit</w:t>
+      </w:r>
+      <w:r>
+        <w:rPr>
+          <w:rFonts w:ascii="David" w:eastAsia="David" w:hAnsi="David" w:cs="David"/>
+          <w:sz w:val="22"/>
+          <w:szCs w:val="22"/>
+          <w:rtl/>
+        </w:rPr>
+        <w:t xml:space="preserve">, ואף </w:t>
+      </w:r>
+      <w:r>
+        <w:rPr>
+          <w:rFonts w:ascii="David" w:eastAsia="David" w:hAnsi="David" w:cs="David"/>
+          <w:sz w:val="22"/>
+          <w:szCs w:val="22"/>
+          <w:rtl w:val="0"/>
+        </w:rPr>
+        <w:t xml:space="preserve">State, Guard</w:t>
+      </w:r>
+      <w:r>
+        <w:rPr>
+          <w:rFonts w:ascii="David" w:eastAsia="David" w:hAnsi="David" w:cs="David"/>
+          <w:sz w:val="22"/>
+          <w:szCs w:val="22"/>
+          <w:rtl/>
+        </w:rPr>
+        <w:t xml:space="preserve">, החלטת </w:t>
+      </w:r>
+      <w:r>
+        <w:rPr>
+          <w:rFonts w:ascii="David" w:eastAsia="David" w:hAnsi="David" w:cs="David"/>
+          <w:sz w:val="22"/>
+          <w:szCs w:val="22"/>
+          <w:rtl w:val="0"/>
+        </w:rPr>
+        <w:t xml:space="preserve">Policy</w:t>
+      </w:r>
+      <w:r>
+        <w:rPr>
+          <w:rFonts w:ascii="David" w:eastAsia="David" w:hAnsi="David" w:cs="David"/>
+          <w:sz w:val="22"/>
+          <w:szCs w:val="22"/>
+          <w:rtl/>
+        </w:rPr>
+        <w:t xml:space="preserve"> או חוק </w:t>
+      </w:r>
+      <w:r>
+        <w:rPr>
+          <w:rFonts w:ascii="David" w:eastAsia="David" w:hAnsi="David" w:cs="David"/>
+          <w:sz w:val="22"/>
+          <w:szCs w:val="22"/>
+          <w:rtl w:val="0"/>
+        </w:rPr>
+        <w:t xml:space="preserve">Temporal</w:t>
+      </w:r>
+      <w:r>
+        <w:rPr>
+          <w:rFonts w:ascii="David" w:eastAsia="David" w:hAnsi="David" w:cs="David"/>
+          <w:sz w:val="22"/>
+          <w:szCs w:val="22"/>
+          <w:rtl/>
+        </w:rPr>
+        <w:t xml:space="preserve"> לא קוראים אותו. כשל ברישום נרשם בלוג ואינו עוצר פנייה. זו הנקודה היחידה במערכת שאינה </w:t>
+      </w:r>
+      <w:r>
+        <w:rPr>
+          <w:rFonts w:ascii="David" w:eastAsia="David" w:hAnsi="David" w:cs="David"/>
+          <w:sz w:val="22"/>
+          <w:szCs w:val="22"/>
+          <w:rtl w:val="0"/>
+        </w:rPr>
+        <w:t xml:space="preserve">fail-closed</w:t>
+      </w:r>
+      <w:r>
+        <w:rPr>
+          <w:rFonts w:ascii="David" w:eastAsia="David" w:hAnsi="David" w:cs="David"/>
+          <w:sz w:val="22"/>
+          <w:szCs w:val="22"/>
+          <w:rtl/>
+        </w:rPr>
+        <w:t xml:space="preserve">, משום שאינה בקרת בטיחות. העלויות מוצגות במסך המדדים למנהל בלבד. (תיקון 94)</w:t>
+      </w:r>
+    </w:p>
+    <w:p>
+      <w:pPr>
+        <w:pStyle w:val="Heading2"/>
+        <w:keepNext/>
+        <w:keepLines/>
+        <w:bidi/>
+        <w:spacing w:before="220" w:after="100"/>
+      </w:pPr>
+      <w:r>
+        <w:rPr>
+          <w:rFonts w:ascii="David" w:eastAsia="David" w:hAnsi="David" w:cs="David"/>
+          <w:b/>
+          <w:bCs/>
+          <w:color w:val="000000"/>
+          <w:sz w:val="22"/>
+          <w:szCs w:val="22"/>
+          <w:rtl/>
+        </w:rPr>
+        <w:t xml:space="preserve">19.10 יומן המעקב לצוות, הוכחות העקביות ושמירת הסיווג</w:t>
+      </w:r>
+    </w:p>
+    <w:p>
+      <w:pPr>
+        <w:bidi/>
+        <w:spacing w:after="100"/>
+      </w:pPr>
+      <w:r>
+        <w:rPr>
+          <w:rFonts w:ascii="David" w:eastAsia="David" w:hAnsi="David" w:cs="David"/>
+          <w:sz w:val="22"/>
+          <w:szCs w:val="22"/>
+          <w:rtl/>
+        </w:rPr>
+        <w:t xml:space="preserve">יומן ה־</w:t>
+      </w:r>
+      <w:r>
+        <w:rPr>
+          <w:rFonts w:ascii="David" w:eastAsia="David" w:hAnsi="David" w:cs="David"/>
+          <w:sz w:val="22"/>
+          <w:szCs w:val="22"/>
+          <w:rtl w:val="0"/>
+        </w:rPr>
+        <w:t xml:space="preserve">Audit</w:t>
+      </w:r>
+      <w:r>
+        <w:rPr>
+          <w:rFonts w:ascii="David" w:eastAsia="David" w:hAnsi="David" w:cs="David"/>
+          <w:sz w:val="22"/>
+          <w:szCs w:val="22"/>
+          <w:rtl/>
+        </w:rPr>
+        <w:t xml:space="preserve"> של הפנייה מוצג לצוות כסיפור: סיכום של השערים שעברו, החלטות המדיניות, בדיקות </w:t>
+      </w:r>
+      <w:r>
+        <w:rPr>
+          <w:rFonts w:ascii="David" w:eastAsia="David" w:hAnsi="David" w:cs="David"/>
+          <w:sz w:val="22"/>
+          <w:szCs w:val="22"/>
+          <w:rtl w:val="0"/>
+        </w:rPr>
+        <w:t xml:space="preserve">Z3</w:t>
+      </w:r>
+      <w:r>
+        <w:rPr>
+          <w:rFonts w:ascii="David" w:eastAsia="David" w:hAnsi="David" w:cs="David"/>
+          <w:sz w:val="22"/>
+          <w:szCs w:val="22"/>
+          <w:rtl/>
+        </w:rPr>
+        <w:t xml:space="preserve">, החסימות, ניסיונות הביצוע וקריאות ה־</w:t>
+      </w:r>
+      <w:r>
+        <w:rPr>
+          <w:rFonts w:ascii="David" w:eastAsia="David" w:hAnsi="David" w:cs="David"/>
+          <w:sz w:val="22"/>
+          <w:szCs w:val="22"/>
+          <w:rtl w:val="0"/>
+        </w:rPr>
+        <w:t xml:space="preserve">LLM</w:t>
+      </w:r>
+      <w:r>
+        <w:rPr>
+          <w:rFonts w:ascii="David" w:eastAsia="David" w:hAnsi="David" w:cs="David"/>
+          <w:sz w:val="22"/>
+          <w:szCs w:val="22"/>
+          <w:rtl/>
+        </w:rPr>
+        <w:t xml:space="preserve">; השורות מקובצות לפי שלב בתהליך; ולצד כל קוד תווית בעברית. </w:t>
+      </w:r>
+      <w:r>
+        <w:rPr>
+          <w:rFonts w:ascii="David" w:eastAsia="David" w:hAnsi="David" w:cs="David"/>
+          <w:sz w:val="22"/>
+          <w:szCs w:val="22"/>
+          <w:rtl w:val="0"/>
+        </w:rPr>
+        <w:t xml:space="preserve">GET /api/staff/cases/{id}/context</w:t>
+      </w:r>
+      <w:r>
+        <w:rPr>
+          <w:rFonts w:ascii="David" w:eastAsia="David" w:hAnsi="David" w:cs="David"/>
+          <w:sz w:val="22"/>
+          <w:szCs w:val="22"/>
+          <w:rtl/>
+        </w:rPr>
+        <w:t xml:space="preserve"> מחזיר לשם כך לכל שורה את ה־</w:t>
+      </w:r>
+      <w:r>
+        <w:rPr>
+          <w:rFonts w:ascii="David" w:eastAsia="David" w:hAnsi="David" w:cs="David"/>
+          <w:sz w:val="22"/>
+          <w:szCs w:val="22"/>
+          <w:rtl w:val="0"/>
+        </w:rPr>
+        <w:t xml:space="preserve">guards</w:t>
+      </w:r>
+      <w:r>
+        <w:rPr>
+          <w:rFonts w:ascii="David" w:eastAsia="David" w:hAnsi="David" w:cs="David"/>
+          <w:sz w:val="22"/>
+          <w:szCs w:val="22"/>
+          <w:rtl/>
+        </w:rPr>
+        <w:t xml:space="preserve"> ואת נתוני הביצוע, ואת הסיווג האחרון של הפנייה ואת ניסיונות ה־</w:t>
+      </w:r>
+      <w:r>
+        <w:rPr>
+          <w:rFonts w:ascii="David" w:eastAsia="David" w:hAnsi="David" w:cs="David"/>
+          <w:sz w:val="22"/>
+          <w:szCs w:val="22"/>
+          <w:rtl w:val="0"/>
+        </w:rPr>
+        <w:t xml:space="preserve">LLM</w:t>
+      </w:r>
+      <w:r>
+        <w:rPr>
+          <w:rFonts w:ascii="David" w:eastAsia="David" w:hAnsi="David" w:cs="David"/>
+          <w:sz w:val="22"/>
+          <w:szCs w:val="22"/>
+          <w:rtl/>
+        </w:rPr>
+        <w:t xml:space="preserve"> שלה (קודים וזמנים בלבד), וכולם חלק מ־</w:t>
+      </w:r>
+      <w:r>
+        <w:rPr>
+          <w:rFonts w:ascii="David" w:eastAsia="David" w:hAnsi="David" w:cs="David"/>
+          <w:sz w:val="22"/>
+          <w:szCs w:val="22"/>
+          <w:rtl w:val="0"/>
+        </w:rPr>
+        <w:t xml:space="preserve">shown_context_ref.</w:t>
+      </w:r>
+      <w:r>
+        <w:rPr>
+          <w:rFonts w:ascii="David" w:eastAsia="David" w:hAnsi="David" w:cs="David"/>
+          <w:sz w:val="22"/>
+          <w:szCs w:val="22"/>
+          <w:rtl/>
+        </w:rPr>
+        <w:t xml:space="preserve"> אין שינוי בסכמה. (תיקון 95)</w:t>
+      </w:r>
+    </w:p>
+    <w:p>
+      <w:pPr>
+        <w:bidi/>
+        <w:spacing w:after="100"/>
+      </w:pPr>
+      <w:r>
+        <w:rPr>
+          <w:rFonts w:ascii="David" w:eastAsia="David" w:hAnsi="David" w:cs="David"/>
+          <w:sz w:val="22"/>
+          <w:szCs w:val="22"/>
+          <w:rtl/>
+        </w:rPr>
+        <w:t xml:space="preserve">לכל שורת מדיניות מוצגים </w:t>
+      </w:r>
+      <w:r>
+        <w:rPr>
+          <w:rFonts w:ascii="David" w:eastAsia="David" w:hAnsi="David" w:cs="David"/>
+          <w:sz w:val="22"/>
+          <w:szCs w:val="22"/>
+          <w:rtl w:val="0"/>
+        </w:rPr>
+        <w:t xml:space="preserve">OPA</w:t>
+      </w:r>
+      <w:r>
+        <w:rPr>
+          <w:rFonts w:ascii="David" w:eastAsia="David" w:hAnsi="David" w:cs="David"/>
+          <w:sz w:val="22"/>
+          <w:szCs w:val="22"/>
+          <w:rtl/>
+        </w:rPr>
+        <w:t xml:space="preserve"> (18 כללי ה־</w:t>
+      </w:r>
+      <w:r>
+        <w:rPr>
+          <w:rFonts w:ascii="David" w:eastAsia="David" w:hAnsi="David" w:cs="David"/>
+          <w:sz w:val="22"/>
+          <w:szCs w:val="22"/>
+          <w:rtl w:val="0"/>
+        </w:rPr>
+        <w:t xml:space="preserve">deny</w:t>
+      </w:r>
+      <w:r>
+        <w:rPr>
+          <w:rFonts w:ascii="David" w:eastAsia="David" w:hAnsi="David" w:cs="David"/>
+          <w:sz w:val="22"/>
+          <w:szCs w:val="22"/>
+          <w:rtl/>
+        </w:rPr>
+        <w:t xml:space="preserve"> של </w:t>
+      </w:r>
+      <w:r>
+        <w:rPr>
+          <w:rFonts w:ascii="David" w:eastAsia="David" w:hAnsi="David" w:cs="David"/>
+          <w:sz w:val="22"/>
+          <w:szCs w:val="22"/>
+          <w:rtl w:val="0"/>
+        </w:rPr>
+        <w:t xml:space="preserve">policy.rego</w:t>
+      </w:r>
+      <w:r>
+        <w:rPr>
+          <w:rFonts w:ascii="David" w:eastAsia="David" w:hAnsi="David" w:cs="David"/>
+          <w:sz w:val="22"/>
+          <w:szCs w:val="22"/>
+          <w:rtl/>
+        </w:rPr>
+        <w:t xml:space="preserve">), </w:t>
+      </w:r>
+      <w:r>
+        <w:rPr>
+          <w:rFonts w:ascii="David" w:eastAsia="David" w:hAnsi="David" w:cs="David"/>
+          <w:sz w:val="22"/>
+          <w:szCs w:val="22"/>
+          <w:rtl w:val="0"/>
+        </w:rPr>
+        <w:t xml:space="preserve">Prolog</w:t>
+      </w:r>
+      <w:r>
+        <w:rPr>
+          <w:rFonts w:ascii="David" w:eastAsia="David" w:hAnsi="David" w:cs="David"/>
+          <w:sz w:val="22"/>
+          <w:szCs w:val="22"/>
+          <w:rtl/>
+        </w:rPr>
+        <w:t xml:space="preserve"> (בדיקות </w:t>
+      </w:r>
+      <w:r>
+        <w:rPr>
+          <w:rFonts w:ascii="David" w:eastAsia="David" w:hAnsi="David" w:cs="David"/>
+          <w:sz w:val="22"/>
+          <w:szCs w:val="22"/>
+          <w:rtl w:val="0"/>
+        </w:rPr>
+        <w:t xml:space="preserve">explain/4</w:t>
+      </w:r>
+      <w:r>
+        <w:rPr>
+          <w:rFonts w:ascii="David" w:eastAsia="David" w:hAnsi="David" w:cs="David"/>
+          <w:sz w:val="22"/>
+          <w:szCs w:val="22"/>
+          <w:rtl/>
+        </w:rPr>
+        <w:t xml:space="preserve"> לפי הסדר: מה עבר, מה נכשל ומה לא נבדק), </w:t>
+      </w:r>
+      <w:r>
+        <w:rPr>
+          <w:rFonts w:ascii="David" w:eastAsia="David" w:hAnsi="David" w:cs="David"/>
+          <w:sz w:val="22"/>
+          <w:szCs w:val="22"/>
+          <w:rtl w:val="0"/>
+        </w:rPr>
+        <w:t xml:space="preserve">Datalog</w:t>
+      </w:r>
+      <w:r>
+        <w:rPr>
+          <w:rFonts w:ascii="David" w:eastAsia="David" w:hAnsi="David" w:cs="David"/>
+          <w:sz w:val="22"/>
+          <w:szCs w:val="22"/>
+          <w:rtl/>
+        </w:rPr>
+        <w:t xml:space="preserve"> (מערכת היעד, השדות שהפעולה שולחת והשדות החסומים לפי </w:t>
+      </w:r>
+      <w:r>
+        <w:rPr>
+          <w:rFonts w:ascii="David" w:eastAsia="David" w:hAnsi="David" w:cs="David"/>
+          <w:sz w:val="22"/>
+          <w:szCs w:val="22"/>
+          <w:rtl w:val="0"/>
+        </w:rPr>
+        <w:t xml:space="preserve">flows.dl</w:t>
+      </w:r>
+      <w:r>
+        <w:rPr>
+          <w:rFonts w:ascii="David" w:eastAsia="David" w:hAnsi="David" w:cs="David"/>
+          <w:sz w:val="22"/>
+          <w:szCs w:val="22"/>
+          <w:rtl/>
+        </w:rPr>
+        <w:t xml:space="preserve">), ובשורת </w:t>
+      </w:r>
+      <w:r>
+        <w:rPr>
+          <w:rFonts w:ascii="David" w:eastAsia="David" w:hAnsi="David" w:cs="David"/>
+          <w:sz w:val="22"/>
+          <w:szCs w:val="22"/>
+          <w:rtl w:val="0"/>
+        </w:rPr>
+        <w:t xml:space="preserve">MISSING_INFORMATION_DETECTED</w:t>
+      </w:r>
+      <w:r>
+        <w:rPr>
+          <w:rFonts w:ascii="David" w:eastAsia="David" w:hAnsi="David" w:cs="David"/>
+          <w:sz w:val="22"/>
+          <w:szCs w:val="22"/>
+          <w:rtl/>
+        </w:rPr>
+        <w:t xml:space="preserve"> גם מודל </w:t>
+      </w:r>
+      <w:r>
+        <w:rPr>
+          <w:rFonts w:ascii="David" w:eastAsia="David" w:hAnsi="David" w:cs="David"/>
+          <w:sz w:val="22"/>
+          <w:szCs w:val="22"/>
+          <w:rtl w:val="0"/>
+        </w:rPr>
+        <w:t xml:space="preserve">Z3</w:t>
+      </w:r>
+      <w:r>
+        <w:rPr>
+          <w:rFonts w:ascii="David" w:eastAsia="David" w:hAnsi="David" w:cs="David"/>
+          <w:sz w:val="22"/>
+          <w:szCs w:val="22"/>
+          <w:rtl/>
+        </w:rPr>
+        <w:t xml:space="preserve"> של §9.1 ותוצאתו. ה־</w:t>
+      </w:r>
+      <w:r>
+        <w:rPr>
+          <w:rFonts w:ascii="David" w:eastAsia="David" w:hAnsi="David" w:cs="David"/>
+          <w:sz w:val="22"/>
+          <w:szCs w:val="22"/>
+          <w:rtl w:val="0"/>
+        </w:rPr>
+        <w:t xml:space="preserve">Audit</w:t>
+      </w:r>
+      <w:r>
+        <w:rPr>
+          <w:rFonts w:ascii="David" w:eastAsia="David" w:hAnsi="David" w:cs="David"/>
+          <w:sz w:val="22"/>
+          <w:szCs w:val="22"/>
+          <w:rtl/>
+        </w:rPr>
+        <w:t xml:space="preserve"> שומר את התוצאה המאוחדת בלבד, ולכן הפירוט נגזר מהשורה ומקבצי המנועים; בדיקות ה־</w:t>
+      </w:r>
+      <w:r>
+        <w:rPr>
+          <w:rFonts w:ascii="David" w:eastAsia="David" w:hAnsi="David" w:cs="David"/>
+          <w:sz w:val="22"/>
+          <w:szCs w:val="22"/>
+          <w:rtl w:val="0"/>
+        </w:rPr>
+        <w:t xml:space="preserve">frontend</w:t>
+      </w:r>
+      <w:r>
+        <w:rPr>
+          <w:rFonts w:ascii="David" w:eastAsia="David" w:hAnsi="David" w:cs="David"/>
+          <w:sz w:val="22"/>
+          <w:szCs w:val="22"/>
+          <w:rtl/>
+        </w:rPr>
+        <w:t xml:space="preserve"> משוות כל רשימה לקובץ המקור שלה. מסך המדדים מריץ לפי דרישה את הוכחות העקביות של §9.2 (9 שאילתות </w:t>
+      </w:r>
+      <w:r>
+        <w:rPr>
+          <w:rFonts w:ascii="David" w:eastAsia="David" w:hAnsi="David" w:cs="David"/>
+          <w:sz w:val="22"/>
+          <w:szCs w:val="22"/>
+          <w:rtl w:val="0"/>
+        </w:rPr>
+        <w:t xml:space="preserve">UNSAT, 7</w:t>
+      </w:r>
+      <w:r>
+        <w:rPr>
+          <w:rFonts w:ascii="David" w:eastAsia="David" w:hAnsi="David" w:cs="David"/>
+          <w:sz w:val="22"/>
+          <w:szCs w:val="22"/>
+          <w:rtl/>
+        </w:rPr>
+        <w:t xml:space="preserve"> תכונות) דרך </w:t>
+      </w:r>
+      <w:r>
+        <w:rPr>
+          <w:rFonts w:ascii="David" w:eastAsia="David" w:hAnsi="David" w:cs="David"/>
+          <w:sz w:val="22"/>
+          <w:szCs w:val="22"/>
+          <w:rtl w:val="0"/>
+        </w:rPr>
+        <w:t xml:space="preserve">GET /api/admin/consistency.</w:t>
+      </w:r>
+      <w:r>
+        <w:rPr>
+          <w:rFonts w:ascii="David" w:eastAsia="David" w:hAnsi="David" w:cs="David"/>
+          <w:sz w:val="22"/>
+          <w:szCs w:val="22"/>
+          <w:rtl/>
+        </w:rPr>
+        <w:t xml:space="preserve"> (תיקון 95)</w:t>
+      </w:r>
+    </w:p>
+    <w:p>
+      <w:pPr>
+        <w:bidi/>
+        <w:spacing w:after="100"/>
+      </w:pPr>
+      <w:r>
+        <w:rPr>
+          <w:rFonts w:ascii="David" w:eastAsia="David" w:hAnsi="David" w:cs="David"/>
+          <w:sz w:val="22"/>
+          <w:szCs w:val="22"/>
+          <w:rtl/>
+        </w:rPr>
+        <w:t xml:space="preserve">פנייה שסווגה </w:t>
+      </w:r>
+      <w:r>
+        <w:rPr>
+          <w:rFonts w:ascii="David" w:eastAsia="David" w:hAnsi="David" w:cs="David"/>
+          <w:sz w:val="22"/>
+          <w:szCs w:val="22"/>
+          <w:rtl w:val="0"/>
+        </w:rPr>
+        <w:t xml:space="preserve">Unsupported</w:t>
+      </w:r>
+      <w:r>
+        <w:rPr>
+          <w:rFonts w:ascii="David" w:eastAsia="David" w:hAnsi="David" w:cs="David"/>
+          <w:sz w:val="22"/>
+          <w:szCs w:val="22"/>
+          <w:rtl/>
+        </w:rPr>
+        <w:t xml:space="preserve"> מוסלמת מיד מ־</w:t>
+      </w:r>
+      <w:r>
+        <w:rPr>
+          <w:rFonts w:ascii="David" w:eastAsia="David" w:hAnsi="David" w:cs="David"/>
+          <w:sz w:val="22"/>
+          <w:szCs w:val="22"/>
+          <w:rtl w:val="0"/>
+        </w:rPr>
+        <w:t xml:space="preserve">Classified</w:t>
+      </w:r>
+      <w:r>
+        <w:rPr>
+          <w:rFonts w:ascii="David" w:eastAsia="David" w:hAnsi="David" w:cs="David"/>
+          <w:sz w:val="22"/>
+          <w:szCs w:val="22"/>
+          <w:rtl/>
+        </w:rPr>
+        <w:t xml:space="preserve"> כ־</w:t>
+      </w:r>
+      <w:r>
+        <w:rPr>
+          <w:rFonts w:ascii="David" w:eastAsia="David" w:hAnsi="David" w:cs="David"/>
+          <w:sz w:val="22"/>
+          <w:szCs w:val="22"/>
+          <w:rtl w:val="0"/>
+        </w:rPr>
+        <w:t xml:space="preserve">PlanningFailed</w:t>
+      </w:r>
+      <w:r>
+        <w:rPr>
+          <w:rFonts w:ascii="David" w:eastAsia="David" w:hAnsi="David" w:cs="David"/>
+          <w:sz w:val="22"/>
+          <w:szCs w:val="22"/>
+          <w:rtl/>
+        </w:rPr>
+        <w:t xml:space="preserve"> עם הסיבה </w:t>
+      </w:r>
+      <w:r>
+        <w:rPr>
+          <w:rFonts w:ascii="David" w:eastAsia="David" w:hAnsi="David" w:cs="David"/>
+          <w:sz w:val="22"/>
+          <w:szCs w:val="22"/>
+          <w:rtl w:val="0"/>
+        </w:rPr>
+        <w:t xml:space="preserve">intent_unsupported</w:t>
+      </w:r>
+      <w:r>
+        <w:rPr>
+          <w:rFonts w:ascii="David" w:eastAsia="David" w:hAnsi="David" w:cs="David"/>
+          <w:sz w:val="22"/>
+          <w:szCs w:val="22"/>
+          <w:rtl/>
+        </w:rPr>
+        <w:t xml:space="preserve">, בלי לשאול את ה־</w:t>
+      </w:r>
+      <w:r>
+        <w:rPr>
+          <w:rFonts w:ascii="David" w:eastAsia="David" w:hAnsi="David" w:cs="David"/>
+          <w:sz w:val="22"/>
+          <w:szCs w:val="22"/>
+          <w:rtl w:val="0"/>
+        </w:rPr>
+        <w:t xml:space="preserve">Planner</w:t>
+      </w:r>
+      <w:r>
+        <w:rPr>
+          <w:rFonts w:ascii="David" w:eastAsia="David" w:hAnsi="David" w:cs="David"/>
+          <w:sz w:val="22"/>
+          <w:szCs w:val="22"/>
+          <w:rtl/>
+        </w:rPr>
+        <w:t xml:space="preserve"> שתשובתו ידועה מראש; המעבר בטבלת סעיף 3 זהה. (תיקון 31)</w:t>
+      </w:r>
+    </w:p>
+    <w:p>
+      <w:pPr>
+        <w:bidi/>
+        <w:spacing w:after="100"/>
+      </w:pPr>
+      <w:r>
+        <w:rPr>
+          <w:rFonts w:ascii="David" w:eastAsia="David" w:hAnsi="David" w:cs="David"/>
+          <w:sz w:val="22"/>
+          <w:szCs w:val="22"/>
+          <w:rtl/>
+        </w:rPr>
+        <w:t xml:space="preserve">פנייה שמוסלמת ישירות מ־</w:t>
+      </w:r>
+      <w:r>
+        <w:rPr>
+          <w:rFonts w:ascii="David" w:eastAsia="David" w:hAnsi="David" w:cs="David"/>
+          <w:sz w:val="22"/>
+          <w:szCs w:val="22"/>
+          <w:rtl w:val="0"/>
+        </w:rPr>
+        <w:t xml:space="preserve">Classifying</w:t>
+      </w:r>
+      <w:r>
+        <w:rPr>
+          <w:rFonts w:ascii="David" w:eastAsia="David" w:hAnsi="David" w:cs="David"/>
+          <w:sz w:val="22"/>
+          <w:szCs w:val="22"/>
+          <w:rtl/>
+        </w:rPr>
+        <w:t xml:space="preserve"> (שאלה רפואית, או </w:t>
+      </w:r>
+      <w:r>
+        <w:rPr>
+          <w:rFonts w:ascii="David" w:eastAsia="David" w:hAnsi="David" w:cs="David"/>
+          <w:sz w:val="22"/>
+          <w:szCs w:val="22"/>
+          <w:rtl w:val="0"/>
+        </w:rPr>
+        <w:t xml:space="preserve">SafetyEscalation</w:t>
+      </w:r>
+      <w:r>
+        <w:rPr>
+          <w:rFonts w:ascii="David" w:eastAsia="David" w:hAnsi="David" w:cs="David"/>
+          <w:sz w:val="22"/>
+          <w:szCs w:val="22"/>
+          <w:rtl/>
+        </w:rPr>
+        <w:t xml:space="preserve">) שומרת עכשיו את הכוונה ורמת הבטיחות שהמסווג החזיר, כך שהצוות רואה במה סווגה. </w:t>
+      </w:r>
+      <w:r>
+        <w:rPr>
+          <w:rFonts w:ascii="David" w:eastAsia="David" w:hAnsi="David" w:cs="David"/>
+          <w:sz w:val="22"/>
+          <w:szCs w:val="22"/>
+          <w:rtl w:val="0"/>
+        </w:rPr>
+        <w:t xml:space="preserve">ClassificationFailed</w:t>
+      </w:r>
+      <w:r>
+        <w:rPr>
+          <w:rFonts w:ascii="David" w:eastAsia="David" w:hAnsi="David" w:cs="David"/>
+          <w:sz w:val="22"/>
+          <w:szCs w:val="22"/>
+          <w:rtl/>
+        </w:rPr>
+        <w:t xml:space="preserve"> ו־</w:t>
+      </w:r>
+      <w:r>
+        <w:rPr>
+          <w:rFonts w:ascii="David" w:eastAsia="David" w:hAnsi="David" w:cs="David"/>
+          <w:sz w:val="22"/>
+          <w:szCs w:val="22"/>
+          <w:rtl w:val="0"/>
+        </w:rPr>
+        <w:t xml:space="preserve">TemporalViolation</w:t>
+      </w:r>
+      <w:r>
+        <w:rPr>
+          <w:rFonts w:ascii="David" w:eastAsia="David" w:hAnsi="David" w:cs="David"/>
+          <w:sz w:val="22"/>
+          <w:szCs w:val="22"/>
+          <w:rtl/>
+        </w:rPr>
+        <w:t xml:space="preserve"> אינם נושאים סיווג ואינם משנים את הפנייה, ורמת הסיכון רק עולה. (תיקון 96)</w:t>
       </w:r>
     </w:p>
     <w:sectPr>

</xml_diff>

<commit_message>
Keep the LLM and upload attempts out of shown_context_ref, and truncate upload_attempts in obs.golden
- The journal's llm_calls and upload_attempts are bookkeeping written in the
  background (rows 94, 98): they stay in /context but out of the hash a decision is
  bound to, so a reviewer's decision is never refused as context_changed because one
  was added meanwhile. test_llm_cost_api caught it; a new test pins the same for an
  upload attempt.
- obs.golden's own TRUNCATE now includes upload_attempts (it references cases).
- The document-service status is reset before every test (process memory).

Co-Authored-By: Claude Opus 5.5 <noreply@anthropic.com>
</commit_message>
<xml_diff>
--- a/Hospital_Agent_Clean_v2.docx
+++ b/Hospital_Agent_Clean_v2.docx
@@ -58085,25 +58085,43 @@
           <w:szCs w:val="22"/>
           <w:rtl/>
         </w:rPr>
-        <w:t xml:space="preserve"> שלה (קודים וזמנים בלבד), וכולם חלק מ־</w:t>
-      </w:r>
-      <w:r>
-        <w:rPr>
-          <w:rFonts w:ascii="David" w:eastAsia="David" w:hAnsi="David" w:cs="David"/>
-          <w:sz w:val="22"/>
-          <w:szCs w:val="22"/>
-          <w:rtl w:val="0"/>
-        </w:rPr>
-        <w:t xml:space="preserve">shown_context_ref.</w:t>
-      </w:r>
-      <w:r>
-        <w:rPr>
-          <w:rFonts w:ascii="David" w:eastAsia="David" w:hAnsi="David" w:cs="David"/>
-          <w:sz w:val="22"/>
-          <w:szCs w:val="22"/>
-          <w:rtl/>
-        </w:rPr>
-        <w:t xml:space="preserve"> אין שינוי בסכמה. (תיקון 95)</w:t>
+        <w:t xml:space="preserve"> שלה (קודים וזמנים בלבד). כולם חלק מ־</w:t>
+      </w:r>
+      <w:r>
+        <w:rPr>
+          <w:rFonts w:ascii="David" w:eastAsia="David" w:hAnsi="David" w:cs="David"/>
+          <w:sz w:val="22"/>
+          <w:szCs w:val="22"/>
+          <w:rtl w:val="0"/>
+        </w:rPr>
+        <w:t xml:space="preserve">shown_context_ref</w:t>
+      </w:r>
+      <w:r>
+        <w:rPr>
+          <w:rFonts w:ascii="David" w:eastAsia="David" w:hAnsi="David" w:cs="David"/>
+          <w:sz w:val="22"/>
+          <w:szCs w:val="22"/>
+          <w:rtl/>
+        </w:rPr>
+        <w:t xml:space="preserve"> מלבד ניסיונות ה־</w:t>
+      </w:r>
+      <w:r>
+        <w:rPr>
+          <w:rFonts w:ascii="David" w:eastAsia="David" w:hAnsi="David" w:cs="David"/>
+          <w:sz w:val="22"/>
+          <w:szCs w:val="22"/>
+          <w:rtl w:val="0"/>
+        </w:rPr>
+        <w:t xml:space="preserve">LLM</w:t>
+      </w:r>
+      <w:r>
+        <w:rPr>
+          <w:rFonts w:ascii="David" w:eastAsia="David" w:hAnsi="David" w:cs="David"/>
+          <w:sz w:val="22"/>
+          <w:szCs w:val="22"/>
+          <w:rtl/>
+        </w:rPr>
+        <w:t xml:space="preserve">, שהם הנהלת חשבונות שנכתבת ברקע ואסור שתגרום לדחיית החלטה של סוקר. אין שינוי בסכמה. (תיקון 95)</w:t>
       </w:r>
     </w:p>
     <w:p>

</xml_diff>

<commit_message>
Rebuild the spec document: chapter 19.13 (Alloy, row 99) and the measured suite, 1767 passed
Co-Authored-By: Claude Opus 5.5 <noreply@anthropic.com>
</commit_message>
<xml_diff>
--- a/Hospital_Agent_Clean_v2.docx
+++ b/Hospital_Agent_Clean_v2.docx
@@ -46991,7 +46991,7 @@
                 <w:szCs w:val="18"/>
                 <w:rtl/>
               </w:rPr>
-              <w:t xml:space="preserve">1757 </w:t>
+              <w:t xml:space="preserve">1767 </w:t>
             </w:r>
             <w:r>
               <w:rPr>
@@ -54434,7 +54434,31 @@
           <w:szCs w:val="26"/>
           <w:rtl/>
         </w:rPr>
-        <w:t xml:space="preserve">19. תוספות מעבר לאפיון הדמו (תתי-פרויקטים 9–19 ויומן המעקב)</w:t>
+        <w:t xml:space="preserve">19. תוספות מעבר לאפיון הדמו (תתי-פרויקטים 9–19, יומן המעקב ו־</w:t>
+      </w:r>
+      <w:r>
+        <w:rPr>
+          <w:rFonts w:ascii="David" w:eastAsia="David" w:hAnsi="David" w:cs="David"/>
+          <w:b/>
+          <w:bCs/>
+          <w:color w:val="000000"/>
+          <w:sz w:val="26"/>
+          <w:szCs w:val="26"/>
+          <w:rtl w:val="0"/>
+        </w:rPr>
+        <w:t xml:space="preserve">Alloy</w:t>
+      </w:r>
+      <w:r>
+        <w:rPr>
+          <w:rFonts w:ascii="David" w:eastAsia="David" w:hAnsi="David" w:cs="David"/>
+          <w:b/>
+          <w:bCs/>
+          <w:color w:val="000000"/>
+          <w:sz w:val="26"/>
+          <w:szCs w:val="26"/>
+          <w:rtl/>
+        </w:rPr>
+        <w:t xml:space="preserve">)</w:t>
       </w:r>
     </w:p>
     <w:p>
@@ -54467,7 +54491,7 @@
           <w:szCs w:val="22"/>
           <w:rtl/>
         </w:rPr>
-        <w:t xml:space="preserve"> (שורות 65–98). אף אחד מהם אינו משנה את הרשימות של סעיף 2, את 41 השורות של סעיף 3, את קוד ה־</w:t>
+        <w:t xml:space="preserve"> (שורות 65–99). אף אחד מהם אינו משנה את הרשימות של סעיף 2, את 41 השורות של סעיף 3, את קוד ה־</w:t>
       </w:r>
       <w:r>
         <w:rPr>
@@ -59178,6 +59202,354 @@
           <w:rtl/>
         </w:rPr>
         <w:t xml:space="preserve">: ההעלאה היא פעולה של המטופל, וההמתנה של 75 שניות מכסה תקלה רגעית. (תיקון 98)</w:t>
+      </w:r>
+    </w:p>
+    <w:p>
+      <w:pPr>
+        <w:pStyle w:val="Heading2"/>
+        <w:keepNext/>
+        <w:keepLines/>
+        <w:bidi/>
+        <w:spacing w:before="220" w:after="100"/>
+      </w:pPr>
+      <w:r>
+        <w:rPr>
+          <w:rFonts w:ascii="David" w:eastAsia="David" w:hAnsi="David" w:cs="David"/>
+          <w:b/>
+          <w:bCs/>
+          <w:color w:val="000000"/>
+          <w:sz w:val="22"/>
+          <w:szCs w:val="22"/>
+          <w:rtl/>
+        </w:rPr>
+        <w:t xml:space="preserve">19.13 בדיקת </w:t>
+      </w:r>
+      <w:r>
+        <w:rPr>
+          <w:rFonts w:ascii="David" w:eastAsia="David" w:hAnsi="David" w:cs="David"/>
+          <w:b/>
+          <w:bCs/>
+          <w:color w:val="000000"/>
+          <w:sz w:val="22"/>
+          <w:szCs w:val="22"/>
+          <w:rtl w:val="0"/>
+        </w:rPr>
+        <w:t xml:space="preserve">Alloy</w:t>
+      </w:r>
+      <w:r>
+        <w:rPr>
+          <w:rFonts w:ascii="David" w:eastAsia="David" w:hAnsi="David" w:cs="David"/>
+          <w:b/>
+          <w:bCs/>
+          <w:color w:val="000000"/>
+          <w:sz w:val="22"/>
+          <w:szCs w:val="22"/>
+          <w:rtl/>
+        </w:rPr>
+        <w:t xml:space="preserve"> של מכונת המצבים, ותיקון </w:t>
+      </w:r>
+      <w:r>
+        <w:rPr>
+          <w:rFonts w:ascii="David" w:eastAsia="David" w:hAnsi="David" w:cs="David"/>
+          <w:b/>
+          <w:bCs/>
+          <w:color w:val="000000"/>
+          <w:sz w:val="22"/>
+          <w:szCs w:val="22"/>
+          <w:rtl w:val="0"/>
+        </w:rPr>
+        <w:t xml:space="preserve">CanAdvance</w:t>
+      </w:r>
+    </w:p>
+    <w:p>
+      <w:pPr>
+        <w:bidi/>
+        <w:spacing w:after="100"/>
+      </w:pPr>
+      <w:r>
+        <w:rPr>
+          <w:rFonts w:ascii="David" w:eastAsia="David" w:hAnsi="David" w:cs="David"/>
+          <w:sz w:val="22"/>
+          <w:szCs w:val="22"/>
+          <w:rtl w:val="0"/>
+        </w:rPr>
+        <w:t xml:space="preserve">Alloy 6</w:t>
+      </w:r>
+      <w:r>
+        <w:rPr>
+          <w:rFonts w:ascii="David" w:eastAsia="David" w:hAnsi="David" w:cs="David"/>
+          <w:sz w:val="22"/>
+          <w:szCs w:val="22"/>
+          <w:rtl/>
+        </w:rPr>
+        <w:t xml:space="preserve"> בודק את מכונת המצבים עצמה, על כל מסלול עד 20 צעדים. המודל נוצר אוטומטית מ־</w:t>
+      </w:r>
+      <w:r>
+        <w:rPr>
+          <w:rFonts w:ascii="David" w:eastAsia="David" w:hAnsi="David" w:cs="David"/>
+          <w:sz w:val="22"/>
+          <w:szCs w:val="22"/>
+          <w:rtl w:val="0"/>
+        </w:rPr>
+        <w:t xml:space="preserve">fsm.py</w:t>
+      </w:r>
+      <w:r>
+        <w:rPr>
+          <w:rFonts w:ascii="David" w:eastAsia="David" w:hAnsi="David" w:cs="David"/>
+          <w:sz w:val="22"/>
+          <w:szCs w:val="22"/>
+          <w:rtl/>
+        </w:rPr>
+        <w:t xml:space="preserve"> (44 שורות), ובדיקה נכשלת אם הוא סוטה מהקוד. 12 תכונות מתקיימות לכל תוצאה של השערים - בהן אין מצב תקוע, </w:t>
+      </w:r>
+      <w:r>
+        <w:rPr>
+          <w:rFonts w:ascii="David" w:eastAsia="David" w:hAnsi="David" w:cs="David"/>
+          <w:sz w:val="22"/>
+          <w:szCs w:val="22"/>
+          <w:rtl w:val="0"/>
+        </w:rPr>
+        <w:t xml:space="preserve">T5, T8, T11</w:t>
+      </w:r>
+      <w:r>
+        <w:rPr>
+          <w:rFonts w:ascii="David" w:eastAsia="David" w:hAnsi="David" w:cs="David"/>
+          <w:sz w:val="22"/>
+          <w:szCs w:val="22"/>
+          <w:rtl/>
+        </w:rPr>
+        <w:t xml:space="preserve">, רק צוות מוציא פנייה מבקרה, ושאלה רפואית, דחיית מדיניות והסלמת בטיחות אינן חוזרות לאוטומציה. כל 13 המצבים ברי־השגה. התוצאות, המסלולים ותרשים המצבים נמצאים ב־</w:t>
+      </w:r>
+      <w:r>
+        <w:rPr>
+          <w:rFonts w:ascii="David" w:eastAsia="David" w:hAnsi="David" w:cs="David"/>
+          <w:sz w:val="22"/>
+          <w:szCs w:val="22"/>
+          <w:rtl w:val="0"/>
+        </w:rPr>
+        <w:t xml:space="preserve">docs/alloy/RESULTS.md.</w:t>
+      </w:r>
+    </w:p>
+    <w:p>
+      <w:pPr>
+        <w:bidi/>
+        <w:spacing w:after="100"/>
+      </w:pPr>
+      <w:r>
+        <w:rPr>
+          <w:rFonts w:ascii="David" w:eastAsia="David" w:hAnsi="David" w:cs="David"/>
+          <w:sz w:val="22"/>
+          <w:szCs w:val="22"/>
+          <w:rtl w:val="0"/>
+        </w:rPr>
+        <w:t xml:space="preserve">Alloy</w:t>
+      </w:r>
+      <w:r>
+        <w:rPr>
+          <w:rFonts w:ascii="David" w:eastAsia="David" w:hAnsi="David" w:cs="David"/>
+          <w:sz w:val="22"/>
+          <w:szCs w:val="22"/>
+          <w:rtl/>
+        </w:rPr>
+        <w:t xml:space="preserve"> מצא באג אמיתי: </w:t>
+      </w:r>
+      <w:r>
+        <w:rPr>
+          <w:rFonts w:ascii="David" w:eastAsia="David" w:hAnsi="David" w:cs="David"/>
+          <w:sz w:val="22"/>
+          <w:szCs w:val="22"/>
+          <w:rtl w:val="0"/>
+        </w:rPr>
+        <w:t xml:space="preserve">CanAdvance</w:t>
+      </w:r>
+      <w:r>
+        <w:rPr>
+          <w:rFonts w:ascii="David" w:eastAsia="David" w:hAnsi="David" w:cs="David"/>
+          <w:sz w:val="22"/>
+          <w:szCs w:val="22"/>
+          <w:rtl/>
+        </w:rPr>
+        <w:t xml:space="preserve"> בדק רק שיש צעד הבא, ולכן </w:t>
+      </w:r>
+      <w:r>
+        <w:rPr>
+          <w:rFonts w:ascii="David" w:eastAsia="David" w:hAnsi="David" w:cs="David"/>
+          <w:sz w:val="22"/>
+          <w:szCs w:val="22"/>
+          <w:rtl w:val="0"/>
+        </w:rPr>
+        <w:t xml:space="preserve">PLAN_CREATED</w:t>
+      </w:r>
+      <w:r>
+        <w:rPr>
+          <w:rFonts w:ascii="David" w:eastAsia="David" w:hAnsi="David" w:cs="David"/>
+          <w:sz w:val="22"/>
+          <w:szCs w:val="22"/>
+          <w:rtl/>
+        </w:rPr>
+        <w:t xml:space="preserve"> ואחריו שלושה </w:t>
+      </w:r>
+      <w:r>
+        <w:rPr>
+          <w:rFonts w:ascii="David" w:eastAsia="David" w:hAnsi="David" w:cs="David"/>
+          <w:sz w:val="22"/>
+          <w:szCs w:val="22"/>
+          <w:rtl w:val="0"/>
+        </w:rPr>
+        <w:t xml:space="preserve">STEP_ADVANCED</w:t>
+      </w:r>
+      <w:r>
+        <w:rPr>
+          <w:rFonts w:ascii="David" w:eastAsia="David" w:hAnsi="David" w:cs="David"/>
+          <w:sz w:val="22"/>
+          <w:szCs w:val="22"/>
+          <w:rtl/>
+        </w:rPr>
+        <w:t xml:space="preserve"> הביאו את התוכנית לצעד המסירה, ו־</w:t>
+      </w:r>
+      <w:r>
+        <w:rPr>
+          <w:rFonts w:ascii="David" w:eastAsia="David" w:hAnsi="David" w:cs="David"/>
+          <w:sz w:val="22"/>
+          <w:szCs w:val="22"/>
+          <w:rtl w:val="0"/>
+        </w:rPr>
+        <w:t xml:space="preserve">POLICY_ALLOWED</w:t>
+      </w:r>
+      <w:r>
+        <w:rPr>
+          <w:rFonts w:ascii="David" w:eastAsia="David" w:hAnsi="David" w:cs="David"/>
+          <w:sz w:val="22"/>
+          <w:szCs w:val="22"/>
+          <w:rtl/>
+        </w:rPr>
+        <w:t xml:space="preserve"> העביר את הפנייה ל־</w:t>
+      </w:r>
+      <w:r>
+        <w:rPr>
+          <w:rFonts w:ascii="David" w:eastAsia="David" w:hAnsi="David" w:cs="David"/>
+          <w:sz w:val="22"/>
+          <w:szCs w:val="22"/>
+          <w:rtl w:val="0"/>
+        </w:rPr>
+        <w:t xml:space="preserve">Delivering</w:t>
+      </w:r>
+      <w:r>
+        <w:rPr>
+          <w:rFonts w:ascii="David" w:eastAsia="David" w:hAnsi="David" w:cs="David"/>
+          <w:sz w:val="22"/>
+          <w:szCs w:val="22"/>
+          <w:rtl/>
+        </w:rPr>
+        <w:t xml:space="preserve"> בלי שליפת נתונים ובלי בדיקת מוכנות. רק סדר הפעולות של ה־</w:t>
+      </w:r>
+      <w:r>
+        <w:rPr>
+          <w:rFonts w:ascii="David" w:eastAsia="David" w:hAnsi="David" w:cs="David"/>
+          <w:sz w:val="22"/>
+          <w:szCs w:val="22"/>
+          <w:rtl w:val="0"/>
+        </w:rPr>
+        <w:t xml:space="preserve">Orchestrator</w:t>
+      </w:r>
+      <w:r>
+        <w:rPr>
+          <w:rFonts w:ascii="David" w:eastAsia="David" w:hAnsi="David" w:cs="David"/>
+          <w:sz w:val="22"/>
+          <w:szCs w:val="22"/>
+          <w:rtl/>
+        </w:rPr>
+        <w:t xml:space="preserve"> מנע זאת. הבאג שוחזר מול ה־</w:t>
+      </w:r>
+      <w:r>
+        <w:rPr>
+          <w:rFonts w:ascii="David" w:eastAsia="David" w:hAnsi="David" w:cs="David"/>
+          <w:sz w:val="22"/>
+          <w:szCs w:val="22"/>
+          <w:rtl w:val="0"/>
+        </w:rPr>
+        <w:t xml:space="preserve">State Manager</w:t>
+      </w:r>
+      <w:r>
+        <w:rPr>
+          <w:rFonts w:ascii="David" w:eastAsia="David" w:hAnsi="David" w:cs="David"/>
+          <w:sz w:val="22"/>
+          <w:szCs w:val="22"/>
+          <w:rtl/>
+        </w:rPr>
+        <w:t xml:space="preserve"> ותוקן: ב־</w:t>
+      </w:r>
+      <w:r>
+        <w:rPr>
+          <w:rFonts w:ascii="David" w:eastAsia="David" w:hAnsi="David" w:cs="David"/>
+          <w:sz w:val="22"/>
+          <w:szCs w:val="22"/>
+          <w:rtl w:val="0"/>
+        </w:rPr>
+        <w:t xml:space="preserve">STEP_ADVANCED</w:t>
+      </w:r>
+      <w:r>
+        <w:rPr>
+          <w:rFonts w:ascii="David" w:eastAsia="David" w:hAnsi="David" w:cs="David"/>
+          <w:sz w:val="22"/>
+          <w:szCs w:val="22"/>
+          <w:rtl/>
+        </w:rPr>
+        <w:t xml:space="preserve"> התוכנית מתקדמת רק בתוך שלב השליפה, וצעד המסירה מושג רק ב־</w:t>
+      </w:r>
+      <w:r>
+        <w:rPr>
+          <w:rFonts w:ascii="David" w:eastAsia="David" w:hAnsi="David" w:cs="David"/>
+          <w:sz w:val="22"/>
+          <w:szCs w:val="22"/>
+          <w:rtl w:val="0"/>
+        </w:rPr>
+        <w:t xml:space="preserve">DELIVERY_PLANNED</w:t>
+      </w:r>
+      <w:r>
+        <w:rPr>
+          <w:rFonts w:ascii="David" w:eastAsia="David" w:hAnsi="David" w:cs="David"/>
+          <w:sz w:val="22"/>
+          <w:szCs w:val="22"/>
+          <w:rtl/>
+        </w:rPr>
+        <w:t xml:space="preserve"> מ־</w:t>
+      </w:r>
+      <w:r>
+        <w:rPr>
+          <w:rFonts w:ascii="David" w:eastAsia="David" w:hAnsi="David" w:cs="David"/>
+          <w:sz w:val="22"/>
+          <w:szCs w:val="22"/>
+          <w:rtl w:val="0"/>
+        </w:rPr>
+        <w:t xml:space="preserve">Ready.</w:t>
+      </w:r>
+      <w:r>
+        <w:rPr>
+          <w:rFonts w:ascii="David" w:eastAsia="David" w:hAnsi="David" w:cs="David"/>
+          <w:sz w:val="22"/>
+          <w:szCs w:val="22"/>
+          <w:rtl/>
+        </w:rPr>
+        <w:t xml:space="preserve"> טבלת סעיף 3 לא השתנתה. שכבת המודל </w:t>
+      </w:r>
+      <w:r>
+        <w:rPr>
+          <w:rFonts w:ascii="David" w:eastAsia="David" w:hAnsi="David" w:cs="David"/>
+          <w:sz w:val="22"/>
+          <w:szCs w:val="22"/>
+          <w:rtl w:val="0"/>
+        </w:rPr>
+        <w:t xml:space="preserve">fsm_plan.als</w:t>
+      </w:r>
+      <w:r>
+        <w:rPr>
+          <w:rFonts w:ascii="David" w:eastAsia="David" w:hAnsi="David" w:cs="David"/>
+          <w:sz w:val="22"/>
+          <w:szCs w:val="22"/>
+          <w:rtl/>
+        </w:rPr>
+        <w:t xml:space="preserve"> מראה את שני הצדדים: עם השער הישן דוגמה נגדית, עם המתוקן התכונה מתקיימת. (תיקון 99)</w:t>
       </w:r>
     </w:p>
     <w:sectPr>

</xml_diff>